<commit_message>
UPDATES TO API ENDPOINT
More updates to the API Endpoint Plan
</commit_message>
<xml_diff>
--- a/ST10496771 - STEFFI TANGANYIKA - PROG62121 PART 1.docx
+++ b/ST10496771 - STEFFI TANGANYIKA - PROG62121 PART 1.docx
@@ -47,7 +47,10 @@
         </w:numPr>
       </w:pPr>
       <w:r>
-        <w:t>One or more organizers can create one or more events</w:t>
+        <w:t xml:space="preserve">One or more organizers can create one or more </w:t>
+      </w:r>
+      <w:r>
+        <w:t>events</w:t>
       </w:r>
     </w:p>
     <w:p>
@@ -83,7 +86,10 @@
         <w:t>is held</w:t>
       </w:r>
       <w:r>
-        <w:t xml:space="preserve"> independently, no two events </w:t>
+        <w:t xml:space="preserve"> independently, no two </w:t>
+      </w:r>
+      <w:r>
+        <w:t xml:space="preserve">events </w:t>
       </w:r>
       <w:r>
         <w:t>are held</w:t>
@@ -107,7 +113,10 @@
         <w:t>have</w:t>
       </w:r>
       <w:r>
-        <w:t xml:space="preserve"> one or more categories</w:t>
+        <w:t xml:space="preserve"> one or more </w:t>
+      </w:r>
+      <w:r>
+        <w:t>categories</w:t>
       </w:r>
     </w:p>
     <w:p>
@@ -119,7 +128,10 @@
         </w:numPr>
       </w:pPr>
       <w:r>
-        <w:t>A participant can take in many categories</w:t>
+        <w:t xml:space="preserve">A participant can take in many </w:t>
+      </w:r>
+      <w:r>
+        <w:t>categories</w:t>
       </w:r>
     </w:p>
     <w:p>
@@ -161,7 +173,10 @@
         </w:numPr>
       </w:pPr>
       <w:r>
-        <w:t>Results are provided for each category</w:t>
+        <w:t>Results</w:t>
+      </w:r>
+      <w:r>
+        <w:t xml:space="preserve"> are provided for each category</w:t>
       </w:r>
     </w:p>
     <w:p>
@@ -660,21 +675,7 @@
                                 <w:b/>
                                 <w:bCs/>
                               </w:rPr>
-                              <w:t>EVENT</w:t>
-                            </w:r>
-                            <w:r>
-                              <w:rPr>
-                                <w:b/>
-                                <w:bCs/>
-                              </w:rPr>
-                              <w:t>_</w:t>
-                            </w:r>
-                            <w:r>
-                              <w:rPr>
-                                <w:b/>
-                                <w:bCs/>
-                              </w:rPr>
-                              <w:t>ENTRANCE</w:t>
+                              <w:t>EVENTENTRANCE</w:t>
                             </w:r>
                           </w:p>
                         </w:txbxContent>
@@ -709,21 +710,7 @@
                           <w:b/>
                           <w:bCs/>
                         </w:rPr>
-                        <w:t>EVENT</w:t>
-                      </w:r>
-                      <w:r>
-                        <w:rPr>
-                          <w:b/>
-                          <w:bCs/>
-                        </w:rPr>
-                        <w:t>_</w:t>
-                      </w:r>
-                      <w:r>
-                        <w:rPr>
-                          <w:b/>
-                          <w:bCs/>
-                        </w:rPr>
-                        <w:t>ENTRANCE</w:t>
+                        <w:t>EVENTENTRANCE</w:t>
                       </w:r>
                     </w:p>
                   </w:txbxContent>
@@ -3225,21 +3212,22 @@
     <w:tbl>
       <w:tblPr>
         <w:tblStyle w:val="TableGrid"/>
-        <w:tblW w:w="0" w:type="auto"/>
+        <w:tblW w:w="15120" w:type="dxa"/>
+        <w:tblInd w:w="-995" w:type="dxa"/>
         <w:tblLook w:val="04A0" w:firstRow="1" w:lastRow="0" w:firstColumn="1" w:lastColumn="0" w:noHBand="0" w:noVBand="1"/>
       </w:tblPr>
       <w:tblGrid>
-        <w:gridCol w:w="1127"/>
-        <w:gridCol w:w="2916"/>
-        <w:gridCol w:w="2022"/>
-        <w:gridCol w:w="1912"/>
+        <w:gridCol w:w="1620"/>
+        <w:gridCol w:w="3989"/>
+        <w:gridCol w:w="1945"/>
+        <w:gridCol w:w="1559"/>
         <w:gridCol w:w="2963"/>
-        <w:gridCol w:w="2010"/>
+        <w:gridCol w:w="3044"/>
       </w:tblGrid>
       <w:tr>
         <w:tc>
           <w:tcPr>
-            <w:tcW w:w="1115" w:type="dxa"/>
+            <w:tcW w:w="1620" w:type="dxa"/>
           </w:tcPr>
           <w:p>
             <w:pPr>
@@ -3259,7 +3247,7 @@
         </w:tc>
         <w:tc>
           <w:tcPr>
-            <w:tcW w:w="2920" w:type="dxa"/>
+            <w:tcW w:w="3989" w:type="dxa"/>
           </w:tcPr>
           <w:p>
             <w:pPr>
@@ -3279,7 +3267,7 @@
         </w:tc>
         <w:tc>
           <w:tcPr>
-            <w:tcW w:w="2024" w:type="dxa"/>
+            <w:tcW w:w="1945" w:type="dxa"/>
           </w:tcPr>
           <w:p>
             <w:pPr>
@@ -3299,7 +3287,7 @@
         </w:tc>
         <w:tc>
           <w:tcPr>
-            <w:tcW w:w="1916" w:type="dxa"/>
+            <w:tcW w:w="1559" w:type="dxa"/>
           </w:tcPr>
           <w:p>
             <w:pPr>
@@ -3339,7 +3327,7 @@
         </w:tc>
         <w:tc>
           <w:tcPr>
-            <w:tcW w:w="2012" w:type="dxa"/>
+            <w:tcW w:w="3044" w:type="dxa"/>
           </w:tcPr>
           <w:p>
             <w:pPr>
@@ -3359,9 +3347,12 @@
         </w:tc>
       </w:tr>
       <w:tr>
-        <w:tc>
-          <w:tcPr>
-            <w:tcW w:w="1115" w:type="dxa"/>
+        <w:trPr>
+          <w:trHeight w:val="2843"/>
+        </w:trPr>
+        <w:tc>
+          <w:tcPr>
+            <w:tcW w:w="1620" w:type="dxa"/>
           </w:tcPr>
           <w:p>
             <w:pPr>
@@ -3388,7 +3379,7 @@
         </w:tc>
         <w:tc>
           <w:tcPr>
-            <w:tcW w:w="2920" w:type="dxa"/>
+            <w:tcW w:w="3989" w:type="dxa"/>
           </w:tcPr>
           <w:p>
             <w:pPr>
@@ -3445,7 +3436,7 @@
         </w:tc>
         <w:tc>
           <w:tcPr>
-            <w:tcW w:w="2024" w:type="dxa"/>
+            <w:tcW w:w="1945" w:type="dxa"/>
           </w:tcPr>
           <w:p>
             <w:pPr>
@@ -3486,7 +3477,7 @@
         </w:tc>
         <w:tc>
           <w:tcPr>
-            <w:tcW w:w="1916" w:type="dxa"/>
+            <w:tcW w:w="1559" w:type="dxa"/>
           </w:tcPr>
           <w:p>
             <w:pPr>
@@ -3526,7 +3517,7 @@
         </w:tc>
         <w:tc>
           <w:tcPr>
-            <w:tcW w:w="2012" w:type="dxa"/>
+            <w:tcW w:w="3044" w:type="dxa"/>
           </w:tcPr>
           <w:p>
             <w:pPr>
@@ -3562,7 +3553,7 @@
       <w:tr>
         <w:tc>
           <w:tcPr>
-            <w:tcW w:w="1115" w:type="dxa"/>
+            <w:tcW w:w="1620" w:type="dxa"/>
           </w:tcPr>
           <w:p>
             <w:r>
@@ -3572,44 +3563,31 @@
         </w:tc>
         <w:tc>
           <w:tcPr>
-            <w:tcW w:w="2920" w:type="dxa"/>
-          </w:tcPr>
-          <w:p>
-            <w:r>
-              <w:t>/</w:t>
-            </w:r>
-            <w:proofErr w:type="spellStart"/>
-            <w:r>
-              <w:t>api</w:t>
-            </w:r>
-            <w:proofErr w:type="spellEnd"/>
-            <w:r>
-              <w:t>/auth/register</w:t>
-            </w:r>
-          </w:p>
-        </w:tc>
-        <w:tc>
-          <w:tcPr>
-            <w:tcW w:w="2024" w:type="dxa"/>
-          </w:tcPr>
-          <w:p>
-            <w:r>
-              <w:t>Registers a new organizer or participant account</w:t>
-            </w:r>
-          </w:p>
-        </w:tc>
-        <w:tc>
-          <w:tcPr>
-            <w:tcW w:w="1916" w:type="dxa"/>
-          </w:tcPr>
-          <w:p>
-            <w:r>
-              <w:t>None</w:t>
-            </w:r>
-          </w:p>
-          <w:p>
-            <w:r>
-              <w:t>(public)</w:t>
+            <w:tcW w:w="3989" w:type="dxa"/>
+          </w:tcPr>
+          <w:p>
+            <w:r>
+              <w:t>/api/auth/register</w:t>
+            </w:r>
+          </w:p>
+        </w:tc>
+        <w:tc>
+          <w:tcPr>
+            <w:tcW w:w="1945" w:type="dxa"/>
+          </w:tcPr>
+          <w:p>
+            <w:r>
+              <w:t>Registers a new Organiser or Participant account.</w:t>
+            </w:r>
+          </w:p>
+        </w:tc>
+        <w:tc>
+          <w:tcPr>
+            <w:tcW w:w="1559" w:type="dxa"/>
+          </w:tcPr>
+          <w:p>
+            <w:r>
+              <w:t>None (public)</w:t>
             </w:r>
           </w:p>
         </w:tc>
@@ -3618,93 +3596,18 @@
             <w:tcW w:w="2963" w:type="dxa"/>
           </w:tcPr>
           <w:p>
-            <w:proofErr w:type="gramStart"/>
-            <w:r>
-              <w:t>{ role</w:t>
-            </w:r>
-            <w:proofErr w:type="gramEnd"/>
-            <w:r>
-              <w:t>,</w:t>
-            </w:r>
-          </w:p>
-          <w:p>
-            <w:proofErr w:type="spellStart"/>
-            <w:r>
-              <w:t>firstName</w:t>
-            </w:r>
-            <w:proofErr w:type="spellEnd"/>
-            <w:r>
-              <w:t>/</w:t>
-            </w:r>
-            <w:proofErr w:type="spellStart"/>
-            <w:r>
-              <w:t>organiserName</w:t>
-            </w:r>
-            <w:proofErr w:type="spellEnd"/>
-            <w:r>
-              <w:t>,</w:t>
-            </w:r>
-          </w:p>
-          <w:p>
-            <w:proofErr w:type="spellStart"/>
-            <w:r>
-              <w:t>lastName</w:t>
-            </w:r>
-            <w:proofErr w:type="spellEnd"/>
-            <w:r>
-              <w:t>, email,</w:t>
-            </w:r>
-          </w:p>
-          <w:p>
-            <w:proofErr w:type="gramStart"/>
-            <w:r>
-              <w:t>password }</w:t>
-            </w:r>
-            <w:proofErr w:type="gramEnd"/>
-          </w:p>
-        </w:tc>
-        <w:tc>
-          <w:tcPr>
-            <w:tcW w:w="2012" w:type="dxa"/>
-          </w:tcPr>
-          <w:p>
-            <w:r>
-              <w:t>201 Created –</w:t>
-            </w:r>
-          </w:p>
-          <w:p>
-            <w:r>
-              <w:t>returns new</w:t>
-            </w:r>
-          </w:p>
-          <w:p>
-            <w:r>
-              <w:t>account (no</w:t>
-            </w:r>
-          </w:p>
-          <w:p>
-            <w:r>
-              <w:t>password) and</w:t>
-            </w:r>
-          </w:p>
-          <w:p>
-            <w:r>
-              <w:t>JWT. 409</w:t>
-            </w:r>
-          </w:p>
-          <w:p>
-            <w:r>
-              <w:t>Conflict –</w:t>
-            </w:r>
-          </w:p>
-          <w:p>
-            <w:r>
-              <w:t>email already</w:t>
-            </w:r>
-          </w:p>
-          <w:p>
-            <w:r>
-              <w:t>registered.</w:t>
+            <w:r>
+              <w:t>{ role, firstName/organiserName, lastName, email, password }</w:t>
+            </w:r>
+          </w:p>
+        </w:tc>
+        <w:tc>
+          <w:tcPr>
+            <w:tcW w:w="3044" w:type="dxa"/>
+          </w:tcPr>
+          <w:p>
+            <w:r>
+              <w:t>201 Created – returns new account (no password) and JWT. 409 Conflict – email already registered.</w:t>
             </w:r>
           </w:p>
         </w:tc>
@@ -3712,7 +3615,7 @@
       <w:tr>
         <w:tc>
           <w:tcPr>
-            <w:tcW w:w="1115" w:type="dxa"/>
+            <w:tcW w:w="1620" w:type="dxa"/>
           </w:tcPr>
           <w:p>
             <w:r>
@@ -3722,7 +3625,69 @@
         </w:tc>
         <w:tc>
           <w:tcPr>
-            <w:tcW w:w="2920" w:type="dxa"/>
+            <w:tcW w:w="3989" w:type="dxa"/>
+          </w:tcPr>
+          <w:p>
+            <w:r>
+              <w:t>/api/auth/login</w:t>
+            </w:r>
+          </w:p>
+        </w:tc>
+        <w:tc>
+          <w:tcPr>
+            <w:tcW w:w="1945" w:type="dxa"/>
+          </w:tcPr>
+          <w:p>
+            <w:r>
+              <w:t>Authenticates an Organiser or Participant and returns an access token.</w:t>
+            </w:r>
+          </w:p>
+        </w:tc>
+        <w:tc>
+          <w:tcPr>
+            <w:tcW w:w="1559" w:type="dxa"/>
+          </w:tcPr>
+          <w:p>
+            <w:r>
+              <w:t>None (public)</w:t>
+            </w:r>
+          </w:p>
+        </w:tc>
+        <w:tc>
+          <w:tcPr>
+            <w:tcW w:w="2963" w:type="dxa"/>
+          </w:tcPr>
+          <w:p>
+            <w:r>
+              <w:t>{ email, password }</w:t>
+            </w:r>
+          </w:p>
+        </w:tc>
+        <w:tc>
+          <w:tcPr>
+            <w:tcW w:w="3044" w:type="dxa"/>
+          </w:tcPr>
+          <w:p>
+            <w:r>
+              <w:t>200 OK – returns JWT and account summary. 401 Unauthorized – invalid credentials.</w:t>
+            </w:r>
+          </w:p>
+        </w:tc>
+      </w:tr>
+      <w:tr>
+        <w:tc>
+          <w:tcPr>
+            <w:tcW w:w="1620" w:type="dxa"/>
+          </w:tcPr>
+          <w:p>
+            <w:r>
+              <w:t>GET</w:t>
+            </w:r>
+          </w:p>
+        </w:tc>
+        <w:tc>
+          <w:tcPr>
+            <w:tcW w:w="3989" w:type="dxa"/>
           </w:tcPr>
           <w:p>
             <w:r>
@@ -3734,40 +3699,113 @@
             </w:r>
             <w:proofErr w:type="spellEnd"/>
             <w:r>
-              <w:t>/auth/login</w:t>
-            </w:r>
-          </w:p>
-        </w:tc>
-        <w:tc>
-          <w:tcPr>
-            <w:tcW w:w="2024" w:type="dxa"/>
-          </w:tcPr>
-          <w:p>
-            <w:r>
-              <w:t xml:space="preserve">Authenticates an </w:t>
+              <w:t>/</w:t>
             </w:r>
             <w:proofErr w:type="spellStart"/>
             <w:r>
+              <w:t>organiser</w:t>
+            </w:r>
+            <w:proofErr w:type="spellEnd"/>
+            <w:r>
+              <w:t>/me</w:t>
+            </w:r>
+          </w:p>
+        </w:tc>
+        <w:tc>
+          <w:tcPr>
+            <w:tcW w:w="1945" w:type="dxa"/>
+          </w:tcPr>
+          <w:p>
+            <w:r>
+              <w:t>Retrieves the profile of the logged-in organiser.</w:t>
+            </w:r>
+          </w:p>
+        </w:tc>
+        <w:tc>
+          <w:tcPr>
+            <w:tcW w:w="1559" w:type="dxa"/>
+          </w:tcPr>
+          <w:p>
+            <w:r>
               <w:t>Organiser</w:t>
             </w:r>
+          </w:p>
+        </w:tc>
+        <w:tc>
+          <w:tcPr>
+            <w:tcW w:w="2963" w:type="dxa"/>
+          </w:tcPr>
+          <w:p>
+            <w:r>
+              <w:t>None</w:t>
+            </w:r>
+          </w:p>
+        </w:tc>
+        <w:tc>
+          <w:tcPr>
+            <w:tcW w:w="3044" w:type="dxa"/>
+          </w:tcPr>
+          <w:p>
+            <w:r>
+              <w:t>200 OK – returns organiser profile. 401 Unauthorized.</w:t>
+            </w:r>
+          </w:p>
+        </w:tc>
+      </w:tr>
+      <w:tr>
+        <w:tc>
+          <w:tcPr>
+            <w:tcW w:w="1620" w:type="dxa"/>
+          </w:tcPr>
+          <w:p>
+            <w:r>
+              <w:t>PUT</w:t>
+            </w:r>
+          </w:p>
+        </w:tc>
+        <w:tc>
+          <w:tcPr>
+            <w:tcW w:w="3989" w:type="dxa"/>
+          </w:tcPr>
+          <w:p>
+            <w:r>
+              <w:t>/</w:t>
+            </w:r>
+            <w:proofErr w:type="spellStart"/>
+            <w:r>
+              <w:t>api</w:t>
+            </w:r>
             <w:proofErr w:type="spellEnd"/>
             <w:r>
-              <w:t xml:space="preserve"> or Participant and returns an access token</w:t>
-            </w:r>
-          </w:p>
-        </w:tc>
-        <w:tc>
-          <w:tcPr>
-            <w:tcW w:w="1916" w:type="dxa"/>
-          </w:tcPr>
-          <w:p>
-            <w:r>
-              <w:t xml:space="preserve">None </w:t>
-            </w:r>
-          </w:p>
-          <w:p>
-            <w:r>
-              <w:t>(public)</w:t>
+              <w:t>/</w:t>
+            </w:r>
+            <w:proofErr w:type="spellStart"/>
+            <w:r>
+              <w:t>organiser</w:t>
+            </w:r>
+            <w:proofErr w:type="spellEnd"/>
+            <w:r>
+              <w:t>/me</w:t>
+            </w:r>
+          </w:p>
+        </w:tc>
+        <w:tc>
+          <w:tcPr>
+            <w:tcW w:w="1945" w:type="dxa"/>
+          </w:tcPr>
+          <w:p>
+            <w:r>
+              <w:t>Updates the logged-in organiser’s contact details.</w:t>
+            </w:r>
+          </w:p>
+        </w:tc>
+        <w:tc>
+          <w:tcPr>
+            <w:tcW w:w="1559" w:type="dxa"/>
+          </w:tcPr>
+          <w:p>
+            <w:r>
+              <w:t>Organiser</w:t>
             </w:r>
           </w:p>
         </w:tc>
@@ -3776,40 +3814,350 @@
             <w:tcW w:w="2963" w:type="dxa"/>
           </w:tcPr>
           <w:p>
+            <w:r>
+              <w:t>{ organiserName, contactDetails }</w:t>
+            </w:r>
+          </w:p>
+        </w:tc>
+        <w:tc>
+          <w:tcPr>
+            <w:tcW w:w="3044" w:type="dxa"/>
+          </w:tcPr>
+          <w:p>
+            <w:r>
+              <w:t>200 OK – returns updated profile. 400 Bad Request.</w:t>
+            </w:r>
+          </w:p>
+        </w:tc>
+      </w:tr>
+      <w:tr>
+        <w:tc>
+          <w:tcPr>
+            <w:tcW w:w="1620" w:type="dxa"/>
+          </w:tcPr>
+          <w:p>
+            <w:r>
+              <w:lastRenderedPageBreak/>
+              <w:t>GET</w:t>
+            </w:r>
+          </w:p>
+        </w:tc>
+        <w:tc>
+          <w:tcPr>
+            <w:tcW w:w="3989" w:type="dxa"/>
+          </w:tcPr>
+          <w:p>
+            <w:r>
+              <w:t>/</w:t>
+            </w:r>
+            <w:proofErr w:type="spellStart"/>
+            <w:r>
+              <w:t>api</w:t>
+            </w:r>
+            <w:proofErr w:type="spellEnd"/>
+            <w:r>
+              <w:t>/</w:t>
+            </w:r>
+            <w:r>
+              <w:t>participant</w:t>
+            </w:r>
+            <w:r>
+              <w:t>/me</w:t>
+            </w:r>
+          </w:p>
+        </w:tc>
+        <w:tc>
+          <w:tcPr>
+            <w:tcW w:w="1945" w:type="dxa"/>
+          </w:tcPr>
+          <w:p>
+            <w:r>
+              <w:t>Retrieves the profile of the logged-in participant.</w:t>
+            </w:r>
+          </w:p>
+        </w:tc>
+        <w:tc>
+          <w:tcPr>
+            <w:tcW w:w="1559" w:type="dxa"/>
+          </w:tcPr>
+          <w:p>
+            <w:r>
+              <w:t>Participant</w:t>
+            </w:r>
+          </w:p>
+        </w:tc>
+        <w:tc>
+          <w:tcPr>
+            <w:tcW w:w="2963" w:type="dxa"/>
+          </w:tcPr>
+          <w:p>
+            <w:r>
+              <w:t>None</w:t>
+            </w:r>
+          </w:p>
+        </w:tc>
+        <w:tc>
+          <w:tcPr>
+            <w:tcW w:w="3044" w:type="dxa"/>
+          </w:tcPr>
+          <w:p>
+            <w:r>
+              <w:t>200 OK – returns participant profile. 401 Unauthorized.</w:t>
+            </w:r>
+          </w:p>
+        </w:tc>
+      </w:tr>
+      <w:tr>
+        <w:tc>
+          <w:tcPr>
+            <w:tcW w:w="1620" w:type="dxa"/>
+          </w:tcPr>
+          <w:p>
+            <w:r>
+              <w:t>PUT</w:t>
+            </w:r>
+          </w:p>
+        </w:tc>
+        <w:tc>
+          <w:tcPr>
+            <w:tcW w:w="3989" w:type="dxa"/>
+          </w:tcPr>
+          <w:p>
+            <w:r>
+              <w:t>/</w:t>
+            </w:r>
+            <w:proofErr w:type="spellStart"/>
+            <w:r>
+              <w:t>api</w:t>
+            </w:r>
+            <w:proofErr w:type="spellEnd"/>
+            <w:r>
+              <w:t>/</w:t>
+            </w:r>
+            <w:r>
+              <w:t>participant</w:t>
+            </w:r>
+            <w:r>
+              <w:t>/me</w:t>
+            </w:r>
+          </w:p>
+        </w:tc>
+        <w:tc>
+          <w:tcPr>
+            <w:tcW w:w="1945" w:type="dxa"/>
+          </w:tcPr>
+          <w:p>
+            <w:r>
+              <w:t>Updates the logged-in participant’s details.</w:t>
+            </w:r>
+          </w:p>
+        </w:tc>
+        <w:tc>
+          <w:tcPr>
+            <w:tcW w:w="1559" w:type="dxa"/>
+          </w:tcPr>
+          <w:p>
+            <w:r>
+              <w:t>Participant</w:t>
+            </w:r>
+          </w:p>
+        </w:tc>
+        <w:tc>
+          <w:tcPr>
+            <w:tcW w:w="2963" w:type="dxa"/>
+          </w:tcPr>
+          <w:p>
+            <w:r>
+              <w:t>{ firstName, lastName }</w:t>
+            </w:r>
+          </w:p>
+        </w:tc>
+        <w:tc>
+          <w:tcPr>
+            <w:tcW w:w="3044" w:type="dxa"/>
+          </w:tcPr>
+          <w:p>
+            <w:r>
+              <w:t>200 OK – returns updated profile. 400 Bad Request.</w:t>
+            </w:r>
+          </w:p>
+        </w:tc>
+      </w:tr>
+      <w:tr>
+        <w:tc>
+          <w:tcPr>
+            <w:tcW w:w="1620" w:type="dxa"/>
+          </w:tcPr>
+          <w:p>
+            <w:r>
+              <w:t>GET</w:t>
+            </w:r>
+          </w:p>
+        </w:tc>
+        <w:tc>
+          <w:tcPr>
+            <w:tcW w:w="3989" w:type="dxa"/>
+          </w:tcPr>
+          <w:p>
+            <w:r>
+              <w:t>/</w:t>
+            </w:r>
+            <w:proofErr w:type="spellStart"/>
+            <w:r>
+              <w:t>api</w:t>
+            </w:r>
+            <w:proofErr w:type="spellEnd"/>
+            <w:r>
+              <w:t>/</w:t>
+            </w:r>
+            <w:r>
+              <w:t>event</w:t>
+            </w:r>
+          </w:p>
+        </w:tc>
+        <w:tc>
+          <w:tcPr>
+            <w:tcW w:w="1945" w:type="dxa"/>
+          </w:tcPr>
+          <w:p>
             <w:proofErr w:type="gramStart"/>
             <w:r>
-              <w:t xml:space="preserve">{ </w:t>
+              <w:t>Lists</w:t>
+            </w:r>
+            <w:proofErr w:type="gramEnd"/>
+            <w:r>
+              <w:t xml:space="preserve"> all </w:t>
+            </w:r>
+            <w:r>
+              <w:t>events</w:t>
+            </w:r>
+            <w:r>
+              <w:t>, with optional filters (date, location).</w:t>
+            </w:r>
+          </w:p>
+        </w:tc>
+        <w:tc>
+          <w:tcPr>
+            <w:tcW w:w="1559" w:type="dxa"/>
+          </w:tcPr>
+          <w:p>
+            <w:r>
+              <w:t>None (public)</w:t>
+            </w:r>
+          </w:p>
+        </w:tc>
+        <w:tc>
+          <w:tcPr>
+            <w:tcW w:w="2963" w:type="dxa"/>
+          </w:tcPr>
+          <w:p>
+            <w:r>
+              <w:t>None</w:t>
+            </w:r>
+          </w:p>
+        </w:tc>
+        <w:tc>
+          <w:tcPr>
+            <w:tcW w:w="3044" w:type="dxa"/>
+          </w:tcPr>
+          <w:p>
+            <w:r>
+              <w:t xml:space="preserve">200 OK – returns array of </w:t>
+            </w:r>
+            <w:r>
+              <w:t>event</w:t>
+            </w:r>
+            <w:r>
+              <w:t>.</w:t>
+            </w:r>
+          </w:p>
+        </w:tc>
+      </w:tr>
+      <w:tr>
+        <w:tc>
+          <w:tcPr>
+            <w:tcW w:w="1620" w:type="dxa"/>
+          </w:tcPr>
+          <w:p>
+            <w:r>
+              <w:t>GET</w:t>
+            </w:r>
+          </w:p>
+        </w:tc>
+        <w:tc>
+          <w:tcPr>
+            <w:tcW w:w="3989" w:type="dxa"/>
+          </w:tcPr>
+          <w:p>
+            <w:r>
+              <w:t>/</w:t>
             </w:r>
             <w:proofErr w:type="spellStart"/>
-            <w:r>
-              <w:t>emal</w:t>
+            <w:proofErr w:type="gramStart"/>
+            <w:r>
+              <w:t>api</w:t>
             </w:r>
             <w:proofErr w:type="spellEnd"/>
             <w:proofErr w:type="gramEnd"/>
             <w:r>
-              <w:t>, password}</w:t>
-            </w:r>
-          </w:p>
-        </w:tc>
-        <w:tc>
-          <w:tcPr>
-            <w:tcW w:w="2012" w:type="dxa"/>
-          </w:tcPr>
-          <w:p>
-            <w:r>
-              <w:t xml:space="preserve">200 OK </w:t>
-            </w:r>
-            <w:r>
-              <w:t>–</w:t>
-            </w:r>
-            <w:r>
-              <w:t xml:space="preserve"> returns</w:t>
-            </w:r>
-            <w:r>
-              <w:t xml:space="preserve"> </w:t>
-            </w:r>
-            <w:r>
-              <w:t>JWT and account summary. 401 Unauthorized – invalid credentials</w:t>
+              <w:t>/</w:t>
+            </w:r>
+            <w:proofErr w:type="gramStart"/>
+            <w:r>
+              <w:t>event</w:t>
+            </w:r>
+            <w:r>
+              <w:t>/{</w:t>
+            </w:r>
+            <w:proofErr w:type="gramEnd"/>
+            <w:r>
+              <w:t>id}</w:t>
+            </w:r>
+          </w:p>
+        </w:tc>
+        <w:tc>
+          <w:tcPr>
+            <w:tcW w:w="1945" w:type="dxa"/>
+          </w:tcPr>
+          <w:p>
+            <w:r>
+              <w:t xml:space="preserve">Retrieves full details for a single event, including its </w:t>
+            </w:r>
+            <w:r>
+              <w:t>category</w:t>
+            </w:r>
+            <w:r>
+              <w:t>.</w:t>
+            </w:r>
+          </w:p>
+        </w:tc>
+        <w:tc>
+          <w:tcPr>
+            <w:tcW w:w="1559" w:type="dxa"/>
+          </w:tcPr>
+          <w:p>
+            <w:r>
+              <w:t>None (public)</w:t>
+            </w:r>
+          </w:p>
+        </w:tc>
+        <w:tc>
+          <w:tcPr>
+            <w:tcW w:w="2963" w:type="dxa"/>
+          </w:tcPr>
+          <w:p>
+            <w:r>
+              <w:t>None</w:t>
+            </w:r>
+          </w:p>
+        </w:tc>
+        <w:tc>
+          <w:tcPr>
+            <w:tcW w:w="3044" w:type="dxa"/>
+          </w:tcPr>
+          <w:p>
+            <w:r>
+              <w:t>200 OK – returns event object. 404 Not Found.</w:t>
             </w:r>
           </w:p>
         </w:tc>
@@ -3817,7 +4165,246 @@
       <w:tr>
         <w:tc>
           <w:tcPr>
-            <w:tcW w:w="1115" w:type="dxa"/>
+            <w:tcW w:w="1620" w:type="dxa"/>
+          </w:tcPr>
+          <w:p>
+            <w:r>
+              <w:t>POST</w:t>
+            </w:r>
+          </w:p>
+        </w:tc>
+        <w:tc>
+          <w:tcPr>
+            <w:tcW w:w="3989" w:type="dxa"/>
+          </w:tcPr>
+          <w:p>
+            <w:r>
+              <w:t>/</w:t>
+            </w:r>
+            <w:proofErr w:type="spellStart"/>
+            <w:r>
+              <w:t>api</w:t>
+            </w:r>
+            <w:proofErr w:type="spellEnd"/>
+            <w:r>
+              <w:t>/</w:t>
+            </w:r>
+            <w:r>
+              <w:t>event</w:t>
+            </w:r>
+          </w:p>
+        </w:tc>
+        <w:tc>
+          <w:tcPr>
+            <w:tcW w:w="1945" w:type="dxa"/>
+          </w:tcPr>
+          <w:p>
+            <w:r>
+              <w:t>Creates a new event owned by the logged-in organiser.</w:t>
+            </w:r>
+          </w:p>
+        </w:tc>
+        <w:tc>
+          <w:tcPr>
+            <w:tcW w:w="1559" w:type="dxa"/>
+          </w:tcPr>
+          <w:p>
+            <w:r>
+              <w:t>Organiser</w:t>
+            </w:r>
+          </w:p>
+        </w:tc>
+        <w:tc>
+          <w:tcPr>
+            <w:tcW w:w="2963" w:type="dxa"/>
+          </w:tcPr>
+          <w:p>
+            <w:r>
+              <w:t>{ eventName, eventDate }</w:t>
+            </w:r>
+          </w:p>
+        </w:tc>
+        <w:tc>
+          <w:tcPr>
+            <w:tcW w:w="3044" w:type="dxa"/>
+          </w:tcPr>
+          <w:p>
+            <w:r>
+              <w:t>201 Created – returns new event. 400 Bad Request.</w:t>
+            </w:r>
+          </w:p>
+        </w:tc>
+      </w:tr>
+      <w:tr>
+        <w:tc>
+          <w:tcPr>
+            <w:tcW w:w="1620" w:type="dxa"/>
+          </w:tcPr>
+          <w:p>
+            <w:r>
+              <w:t>PUT</w:t>
+            </w:r>
+          </w:p>
+        </w:tc>
+        <w:tc>
+          <w:tcPr>
+            <w:tcW w:w="3989" w:type="dxa"/>
+          </w:tcPr>
+          <w:p>
+            <w:r>
+              <w:t>/</w:t>
+            </w:r>
+            <w:proofErr w:type="spellStart"/>
+            <w:proofErr w:type="gramStart"/>
+            <w:r>
+              <w:t>api</w:t>
+            </w:r>
+            <w:proofErr w:type="spellEnd"/>
+            <w:proofErr w:type="gramEnd"/>
+            <w:r>
+              <w:t>/</w:t>
+            </w:r>
+            <w:proofErr w:type="gramStart"/>
+            <w:r>
+              <w:t>event</w:t>
+            </w:r>
+            <w:r>
+              <w:t>/{</w:t>
+            </w:r>
+            <w:proofErr w:type="gramEnd"/>
+            <w:r>
+              <w:t>id}</w:t>
+            </w:r>
+          </w:p>
+        </w:tc>
+        <w:tc>
+          <w:tcPr>
+            <w:tcW w:w="1945" w:type="dxa"/>
+          </w:tcPr>
+          <w:p>
+            <w:r>
+              <w:t>Updates an event owned by the logged-in organiser.</w:t>
+            </w:r>
+          </w:p>
+        </w:tc>
+        <w:tc>
+          <w:tcPr>
+            <w:tcW w:w="1559" w:type="dxa"/>
+          </w:tcPr>
+          <w:p>
+            <w:r>
+              <w:t>Organiser</w:t>
+            </w:r>
+          </w:p>
+        </w:tc>
+        <w:tc>
+          <w:tcPr>
+            <w:tcW w:w="2963" w:type="dxa"/>
+          </w:tcPr>
+          <w:p>
+            <w:r>
+              <w:t>{ eventName, eventDate }</w:t>
+            </w:r>
+          </w:p>
+        </w:tc>
+        <w:tc>
+          <w:tcPr>
+            <w:tcW w:w="3044" w:type="dxa"/>
+          </w:tcPr>
+          <w:p>
+            <w:r>
+              <w:t>200 OK – returns updated event. 403 Forbidden – not the owner. 404 Not Found.</w:t>
+            </w:r>
+          </w:p>
+        </w:tc>
+      </w:tr>
+      <w:tr>
+        <w:tc>
+          <w:tcPr>
+            <w:tcW w:w="1620" w:type="dxa"/>
+          </w:tcPr>
+          <w:p>
+            <w:r>
+              <w:t>DELETE</w:t>
+            </w:r>
+          </w:p>
+        </w:tc>
+        <w:tc>
+          <w:tcPr>
+            <w:tcW w:w="3989" w:type="dxa"/>
+          </w:tcPr>
+          <w:p>
+            <w:r>
+              <w:t>/</w:t>
+            </w:r>
+            <w:proofErr w:type="spellStart"/>
+            <w:proofErr w:type="gramStart"/>
+            <w:r>
+              <w:t>api</w:t>
+            </w:r>
+            <w:proofErr w:type="spellEnd"/>
+            <w:proofErr w:type="gramEnd"/>
+            <w:r>
+              <w:t>/</w:t>
+            </w:r>
+            <w:proofErr w:type="gramStart"/>
+            <w:r>
+              <w:t>event</w:t>
+            </w:r>
+            <w:r>
+              <w:t>/{</w:t>
+            </w:r>
+            <w:proofErr w:type="gramEnd"/>
+            <w:r>
+              <w:t>id}</w:t>
+            </w:r>
+          </w:p>
+        </w:tc>
+        <w:tc>
+          <w:tcPr>
+            <w:tcW w:w="1945" w:type="dxa"/>
+          </w:tcPr>
+          <w:p>
+            <w:r>
+              <w:t>Deletes/cancels an event owned by the logged-in organiser.</w:t>
+            </w:r>
+          </w:p>
+        </w:tc>
+        <w:tc>
+          <w:tcPr>
+            <w:tcW w:w="1559" w:type="dxa"/>
+          </w:tcPr>
+          <w:p>
+            <w:r>
+              <w:t>Organiser</w:t>
+            </w:r>
+          </w:p>
+        </w:tc>
+        <w:tc>
+          <w:tcPr>
+            <w:tcW w:w="2963" w:type="dxa"/>
+          </w:tcPr>
+          <w:p>
+            <w:r>
+              <w:t>None</w:t>
+            </w:r>
+          </w:p>
+        </w:tc>
+        <w:tc>
+          <w:tcPr>
+            <w:tcW w:w="3044" w:type="dxa"/>
+          </w:tcPr>
+          <w:p>
+            <w:r>
+              <w:t>204 No Content. 403 Forbidden. 404 Not Found.</w:t>
+            </w:r>
+          </w:p>
+        </w:tc>
+      </w:tr>
+      <w:tr>
+        <w:tc>
+          <w:tcPr>
+            <w:tcW w:w="1620" w:type="dxa"/>
           </w:tcPr>
           <w:p>
             <w:r>
@@ -3828,95 +4415,92 @@
         </w:tc>
         <w:tc>
           <w:tcPr>
-            <w:tcW w:w="2920" w:type="dxa"/>
+            <w:tcW w:w="3989" w:type="dxa"/>
           </w:tcPr>
           <w:p>
             <w:r>
               <w:t>/</w:t>
             </w:r>
             <w:proofErr w:type="spellStart"/>
+            <w:proofErr w:type="gramStart"/>
             <w:r>
               <w:t>api</w:t>
-            </w:r>
-            <w:proofErr w:type="spellEnd"/>
-            <w:r>
-              <w:t>/</w:t>
-            </w:r>
-            <w:proofErr w:type="spellStart"/>
-            <w:r>
-              <w:t>organisers</w:t>
-            </w:r>
-            <w:proofErr w:type="spellEnd"/>
-            <w:r>
-              <w:t>/me</w:t>
-            </w:r>
-          </w:p>
-        </w:tc>
-        <w:tc>
-          <w:tcPr>
-            <w:tcW w:w="2024" w:type="dxa"/>
-          </w:tcPr>
-          <w:p>
-            <w:r>
-              <w:t xml:space="preserve">Retrieves the profile of the logged-in </w:t>
-            </w:r>
-            <w:proofErr w:type="spellStart"/>
-            <w:r>
-              <w:t>organiser</w:t>
-            </w:r>
-            <w:proofErr w:type="spellEnd"/>
-          </w:p>
-        </w:tc>
-        <w:tc>
-          <w:tcPr>
-            <w:tcW w:w="1916" w:type="dxa"/>
-          </w:tcPr>
-          <w:p>
-            <w:proofErr w:type="spellStart"/>
-            <w:r>
-              <w:t>Organiser</w:t>
-            </w:r>
-            <w:proofErr w:type="spellEnd"/>
-          </w:p>
-        </w:tc>
-        <w:tc>
-          <w:tcPr>
-            <w:tcW w:w="2963" w:type="dxa"/>
-          </w:tcPr>
-          <w:p>
-            <w:proofErr w:type="gramStart"/>
-            <w:r>
-              <w:t xml:space="preserve">{ </w:t>
-            </w:r>
-            <w:proofErr w:type="spellStart"/>
-            <w:r>
-              <w:t>organiserName</w:t>
             </w:r>
             <w:proofErr w:type="spellEnd"/>
             <w:proofErr w:type="gramEnd"/>
             <w:r>
-              <w:t xml:space="preserve">, </w:t>
+              <w:t>/</w:t>
+            </w:r>
+            <w:proofErr w:type="gramStart"/>
+            <w:r>
+              <w:t>event</w:t>
+            </w:r>
+            <w:r>
+              <w:t>/{</w:t>
             </w:r>
             <w:proofErr w:type="spellStart"/>
             <w:r>
-              <w:t>contactDetails</w:t>
+              <w:t>eventId</w:t>
             </w:r>
             <w:proofErr w:type="spellEnd"/>
             <w:r>
-              <w:t>}</w:t>
-            </w:r>
-          </w:p>
-        </w:tc>
-        <w:tc>
-          <w:tcPr>
-            <w:tcW w:w="2012" w:type="dxa"/>
-          </w:tcPr>
-          <w:p>
-            <w:r>
-              <w:t xml:space="preserve">200 OK - </w:t>
-            </w:r>
-            <w:r>
-              <w:t xml:space="preserve"> </w:t>
+              <w:t>}/</w:t>
+            </w:r>
+            <w:proofErr w:type="gramEnd"/>
+            <w:r>
+              <w:t>category</w:t>
+            </w:r>
+          </w:p>
+        </w:tc>
+        <w:tc>
+          <w:tcPr>
+            <w:tcW w:w="1945" w:type="dxa"/>
+          </w:tcPr>
+          <w:p>
+            <w:r>
+              <w:t xml:space="preserve">Lists all </w:t>
+            </w:r>
+            <w:r>
+              <w:t>categories</w:t>
+            </w:r>
+            <w:r>
+              <w:t xml:space="preserve"> under an event.</w:t>
+            </w:r>
+          </w:p>
+        </w:tc>
+        <w:tc>
+          <w:tcPr>
+            <w:tcW w:w="1559" w:type="dxa"/>
+          </w:tcPr>
+          <w:p>
+            <w:r>
+              <w:t>None (public)</w:t>
+            </w:r>
+          </w:p>
+        </w:tc>
+        <w:tc>
+          <w:tcPr>
+            <w:tcW w:w="2963" w:type="dxa"/>
+          </w:tcPr>
+          <w:p>
+            <w:r>
+              <w:t>None</w:t>
+            </w:r>
+          </w:p>
+        </w:tc>
+        <w:tc>
+          <w:tcPr>
+            <w:tcW w:w="3044" w:type="dxa"/>
+          </w:tcPr>
+          <w:p>
+            <w:r>
+              <w:t xml:space="preserve">200 OK – returns array of </w:t>
+            </w:r>
+            <w:r>
+              <w:t>category</w:t>
+            </w:r>
+            <w:r>
+              <w:t>. 404 Not Found.</w:t>
             </w:r>
           </w:p>
         </w:tc>
@@ -3924,135 +4508,90 @@
       <w:tr>
         <w:tc>
           <w:tcPr>
-            <w:tcW w:w="1115" w:type="dxa"/>
-          </w:tcPr>
-          <w:p>
-            <w:r>
-              <w:t>PUT</w:t>
-            </w:r>
-          </w:p>
-        </w:tc>
-        <w:tc>
-          <w:tcPr>
-            <w:tcW w:w="2920" w:type="dxa"/>
+            <w:tcW w:w="1620" w:type="dxa"/>
+          </w:tcPr>
+          <w:p>
+            <w:r>
+              <w:t>POST</w:t>
+            </w:r>
+          </w:p>
+        </w:tc>
+        <w:tc>
+          <w:tcPr>
+            <w:tcW w:w="3989" w:type="dxa"/>
           </w:tcPr>
           <w:p>
             <w:r>
               <w:t>/</w:t>
             </w:r>
             <w:proofErr w:type="spellStart"/>
+            <w:proofErr w:type="gramStart"/>
             <w:r>
               <w:t>api</w:t>
-            </w:r>
-            <w:proofErr w:type="spellEnd"/>
-            <w:r>
-              <w:t>/</w:t>
-            </w:r>
-            <w:proofErr w:type="spellStart"/>
-            <w:r>
-              <w:t>organiser</w:t>
-            </w:r>
-            <w:r>
-              <w:t>s</w:t>
-            </w:r>
-            <w:proofErr w:type="spellEnd"/>
-            <w:r>
-              <w:t>/me</w:t>
-            </w:r>
-          </w:p>
-        </w:tc>
-        <w:tc>
-          <w:tcPr>
-            <w:tcW w:w="2024" w:type="dxa"/>
-          </w:tcPr>
-          <w:p>
-            <w:r>
-              <w:t>Updates the</w:t>
-            </w:r>
-          </w:p>
-          <w:p>
-            <w:r>
-              <w:t>logged-in</w:t>
-            </w:r>
-          </w:p>
-          <w:p>
-            <w:proofErr w:type="spellStart"/>
-            <w:r>
-              <w:t>organiser’s</w:t>
-            </w:r>
-            <w:proofErr w:type="spellEnd"/>
-          </w:p>
-          <w:p>
-            <w:r>
-              <w:t>contact details.</w:t>
-            </w:r>
-          </w:p>
-        </w:tc>
-        <w:tc>
-          <w:tcPr>
-            <w:tcW w:w="1916" w:type="dxa"/>
-          </w:tcPr>
-          <w:p>
-            <w:proofErr w:type="spellStart"/>
-            <w:r>
-              <w:t>Organiser</w:t>
-            </w:r>
-            <w:proofErr w:type="spellEnd"/>
-          </w:p>
-        </w:tc>
-        <w:tc>
-          <w:tcPr>
-            <w:tcW w:w="2963" w:type="dxa"/>
-          </w:tcPr>
-          <w:p>
-            <w:proofErr w:type="gramStart"/>
-            <w:r>
-              <w:t xml:space="preserve">{ </w:t>
-            </w:r>
-            <w:proofErr w:type="spellStart"/>
-            <w:r>
-              <w:t>organiserName</w:t>
             </w:r>
             <w:proofErr w:type="spellEnd"/>
             <w:proofErr w:type="gramEnd"/>
             <w:r>
-              <w:t xml:space="preserve">, </w:t>
+              <w:t>/</w:t>
+            </w:r>
+            <w:proofErr w:type="gramStart"/>
+            <w:r>
+              <w:t>event</w:t>
+            </w:r>
+            <w:r>
+              <w:t>/{</w:t>
             </w:r>
             <w:proofErr w:type="spellStart"/>
             <w:r>
-              <w:t>contactDetails</w:t>
+              <w:t>eventId</w:t>
             </w:r>
             <w:proofErr w:type="spellEnd"/>
             <w:r>
-              <w:t>}</w:t>
-            </w:r>
-          </w:p>
-        </w:tc>
-        <w:tc>
-          <w:tcPr>
-            <w:tcW w:w="2012" w:type="dxa"/>
-          </w:tcPr>
-          <w:p>
-            <w:r>
-              <w:t xml:space="preserve">200 OK - </w:t>
-            </w:r>
-            <w:r>
-              <w:t>returns</w:t>
-            </w:r>
-          </w:p>
-          <w:p>
-            <w:r>
-              <w:t>updated</w:t>
-            </w:r>
-          </w:p>
-          <w:p>
-            <w:r>
-              <w:t>profile. 400</w:t>
-            </w:r>
-          </w:p>
-          <w:p>
-            <w:r>
-              <w:t>Bad Request.</w:t>
+              <w:t>}/</w:t>
+            </w:r>
+            <w:proofErr w:type="gramEnd"/>
+            <w:r>
+              <w:t>category</w:t>
+            </w:r>
+          </w:p>
+        </w:tc>
+        <w:tc>
+          <w:tcPr>
+            <w:tcW w:w="1945" w:type="dxa"/>
+          </w:tcPr>
+          <w:p>
+            <w:r>
+              <w:t>Adds a new category to an event.</w:t>
+            </w:r>
+          </w:p>
+        </w:tc>
+        <w:tc>
+          <w:tcPr>
+            <w:tcW w:w="1559" w:type="dxa"/>
+          </w:tcPr>
+          <w:p>
+            <w:r>
+              <w:t>Organiser</w:t>
+            </w:r>
+          </w:p>
+        </w:tc>
+        <w:tc>
+          <w:tcPr>
+            <w:tcW w:w="2963" w:type="dxa"/>
+          </w:tcPr>
+          <w:p>
+            <w:r>
+              <w:t>{ categoryName }</w:t>
+            </w:r>
+          </w:p>
+        </w:tc>
+        <w:tc>
+          <w:tcPr>
+            <w:tcW w:w="3044" w:type="dxa"/>
+          </w:tcPr>
+          <w:p>
+            <w:r>
+              <w:t>201 Created – returns new category. 403 Forbidden – not the event owner.</w:t>
             </w:r>
           </w:p>
         </w:tc>
@@ -4060,427 +4599,861 @@
       <w:tr>
         <w:tc>
           <w:tcPr>
-            <w:tcW w:w="1115" w:type="dxa"/>
-          </w:tcPr>
-          <w:p>
-            <w:r>
-              <w:t>GET</w:t>
-            </w:r>
-          </w:p>
-        </w:tc>
-        <w:tc>
-          <w:tcPr>
-            <w:tcW w:w="2920" w:type="dxa"/>
-          </w:tcPr>
-          <w:p/>
-        </w:tc>
-        <w:tc>
-          <w:tcPr>
-            <w:tcW w:w="2024" w:type="dxa"/>
-          </w:tcPr>
-          <w:p/>
-        </w:tc>
-        <w:tc>
-          <w:tcPr>
-            <w:tcW w:w="1916" w:type="dxa"/>
-          </w:tcPr>
-          <w:p/>
+            <w:tcW w:w="1620" w:type="dxa"/>
+          </w:tcPr>
+          <w:p>
+            <w:r>
+              <w:t>PUT</w:t>
+            </w:r>
+          </w:p>
+        </w:tc>
+        <w:tc>
+          <w:tcPr>
+            <w:tcW w:w="3989" w:type="dxa"/>
+          </w:tcPr>
+          <w:p>
+            <w:r>
+              <w:t>/</w:t>
+            </w:r>
+            <w:proofErr w:type="spellStart"/>
+            <w:proofErr w:type="gramStart"/>
+            <w:r>
+              <w:t>api</w:t>
+            </w:r>
+            <w:proofErr w:type="spellEnd"/>
+            <w:proofErr w:type="gramEnd"/>
+            <w:r>
+              <w:t>/</w:t>
+            </w:r>
+            <w:proofErr w:type="gramStart"/>
+            <w:r>
+              <w:t>category</w:t>
+            </w:r>
+            <w:r>
+              <w:t>/{</w:t>
+            </w:r>
+            <w:proofErr w:type="gramEnd"/>
+            <w:r>
+              <w:t>id}</w:t>
+            </w:r>
+          </w:p>
+        </w:tc>
+        <w:tc>
+          <w:tcPr>
+            <w:tcW w:w="1945" w:type="dxa"/>
+          </w:tcPr>
+          <w:p>
+            <w:r>
+              <w:t>Updates an existing category.</w:t>
+            </w:r>
+          </w:p>
+        </w:tc>
+        <w:tc>
+          <w:tcPr>
+            <w:tcW w:w="1559" w:type="dxa"/>
+          </w:tcPr>
+          <w:p>
+            <w:r>
+              <w:t>Organiser</w:t>
+            </w:r>
+          </w:p>
         </w:tc>
         <w:tc>
           <w:tcPr>
             <w:tcW w:w="2963" w:type="dxa"/>
           </w:tcPr>
-          <w:p/>
-        </w:tc>
-        <w:tc>
-          <w:tcPr>
-            <w:tcW w:w="2012" w:type="dxa"/>
-          </w:tcPr>
-          <w:p/>
+          <w:p>
+            <w:r>
+              <w:t>{ categoryName }</w:t>
+            </w:r>
+          </w:p>
+        </w:tc>
+        <w:tc>
+          <w:tcPr>
+            <w:tcW w:w="3044" w:type="dxa"/>
+          </w:tcPr>
+          <w:p>
+            <w:r>
+              <w:t>200 OK – returns updated category. 403 Forbidden. 404 Not Found.</w:t>
+            </w:r>
+          </w:p>
         </w:tc>
       </w:tr>
       <w:tr>
         <w:tc>
           <w:tcPr>
-            <w:tcW w:w="1115" w:type="dxa"/>
-          </w:tcPr>
-          <w:p>
-            <w:r>
-              <w:t>PUT</w:t>
-            </w:r>
-          </w:p>
-        </w:tc>
-        <w:tc>
-          <w:tcPr>
-            <w:tcW w:w="2920" w:type="dxa"/>
-          </w:tcPr>
-          <w:p/>
-        </w:tc>
-        <w:tc>
-          <w:tcPr>
-            <w:tcW w:w="2024" w:type="dxa"/>
-          </w:tcPr>
-          <w:p/>
-        </w:tc>
-        <w:tc>
-          <w:tcPr>
-            <w:tcW w:w="1916" w:type="dxa"/>
-          </w:tcPr>
-          <w:p/>
+            <w:tcW w:w="1620" w:type="dxa"/>
+          </w:tcPr>
+          <w:p>
+            <w:r>
+              <w:t>DELETE</w:t>
+            </w:r>
+          </w:p>
+        </w:tc>
+        <w:tc>
+          <w:tcPr>
+            <w:tcW w:w="3989" w:type="dxa"/>
+          </w:tcPr>
+          <w:p>
+            <w:r>
+              <w:t>/</w:t>
+            </w:r>
+            <w:proofErr w:type="spellStart"/>
+            <w:proofErr w:type="gramStart"/>
+            <w:r>
+              <w:t>api</w:t>
+            </w:r>
+            <w:proofErr w:type="spellEnd"/>
+            <w:proofErr w:type="gramEnd"/>
+            <w:r>
+              <w:t>/</w:t>
+            </w:r>
+            <w:proofErr w:type="gramStart"/>
+            <w:r>
+              <w:t>category</w:t>
+            </w:r>
+            <w:r>
+              <w:t>/{</w:t>
+            </w:r>
+            <w:proofErr w:type="gramEnd"/>
+            <w:r>
+              <w:t>id}</w:t>
+            </w:r>
+          </w:p>
+        </w:tc>
+        <w:tc>
+          <w:tcPr>
+            <w:tcW w:w="1945" w:type="dxa"/>
+          </w:tcPr>
+          <w:p>
+            <w:r>
+              <w:t>Removes a category from an event.</w:t>
+            </w:r>
+          </w:p>
+        </w:tc>
+        <w:tc>
+          <w:tcPr>
+            <w:tcW w:w="1559" w:type="dxa"/>
+          </w:tcPr>
+          <w:p>
+            <w:r>
+              <w:t>Organiser</w:t>
+            </w:r>
+          </w:p>
         </w:tc>
         <w:tc>
           <w:tcPr>
             <w:tcW w:w="2963" w:type="dxa"/>
           </w:tcPr>
-          <w:p/>
-        </w:tc>
-        <w:tc>
-          <w:tcPr>
-            <w:tcW w:w="2012" w:type="dxa"/>
-          </w:tcPr>
-          <w:p/>
+          <w:p>
+            <w:r>
+              <w:t>None</w:t>
+            </w:r>
+          </w:p>
+        </w:tc>
+        <w:tc>
+          <w:tcPr>
+            <w:tcW w:w="3044" w:type="dxa"/>
+          </w:tcPr>
+          <w:p>
+            <w:r>
+              <w:t>204 No Content. 403 Forbidden. 404 Not Found.</w:t>
+            </w:r>
+          </w:p>
         </w:tc>
       </w:tr>
       <w:tr>
         <w:tc>
           <w:tcPr>
-            <w:tcW w:w="1115" w:type="dxa"/>
-          </w:tcPr>
-          <w:p/>
-        </w:tc>
-        <w:tc>
-          <w:tcPr>
-            <w:tcW w:w="2920" w:type="dxa"/>
-          </w:tcPr>
-          <w:p/>
-        </w:tc>
-        <w:tc>
-          <w:tcPr>
-            <w:tcW w:w="2024" w:type="dxa"/>
-          </w:tcPr>
-          <w:p/>
-        </w:tc>
-        <w:tc>
-          <w:tcPr>
-            <w:tcW w:w="1916" w:type="dxa"/>
-          </w:tcPr>
-          <w:p/>
+            <w:tcW w:w="1620" w:type="dxa"/>
+          </w:tcPr>
+          <w:p>
+            <w:r>
+              <w:t>POST</w:t>
+            </w:r>
+          </w:p>
+        </w:tc>
+        <w:tc>
+          <w:tcPr>
+            <w:tcW w:w="3989" w:type="dxa"/>
+          </w:tcPr>
+          <w:p>
+            <w:r>
+              <w:t>/</w:t>
+            </w:r>
+            <w:proofErr w:type="spellStart"/>
+            <w:proofErr w:type="gramStart"/>
+            <w:r>
+              <w:t>api</w:t>
+            </w:r>
+            <w:proofErr w:type="spellEnd"/>
+            <w:proofErr w:type="gramEnd"/>
+            <w:r>
+              <w:t>/</w:t>
+            </w:r>
+            <w:r>
+              <w:t>category</w:t>
+            </w:r>
+            <w:r>
+              <w:t>/{id}/</w:t>
+            </w:r>
+            <w:proofErr w:type="spellStart"/>
+            <w:r>
+              <w:t>evententrance</w:t>
+            </w:r>
+            <w:proofErr w:type="spellEnd"/>
+          </w:p>
+        </w:tc>
+        <w:tc>
+          <w:tcPr>
+            <w:tcW w:w="1945" w:type="dxa"/>
+          </w:tcPr>
+          <w:p>
+            <w:r>
+              <w:t>Creates an EventEntrance linking the logged-in participant to this category.</w:t>
+            </w:r>
+          </w:p>
+        </w:tc>
+        <w:tc>
+          <w:tcPr>
+            <w:tcW w:w="1559" w:type="dxa"/>
+          </w:tcPr>
+          <w:p>
+            <w:r>
+              <w:t>Participant</w:t>
+            </w:r>
+          </w:p>
         </w:tc>
         <w:tc>
           <w:tcPr>
             <w:tcW w:w="2963" w:type="dxa"/>
           </w:tcPr>
-          <w:p/>
-        </w:tc>
-        <w:tc>
-          <w:tcPr>
-            <w:tcW w:w="2012" w:type="dxa"/>
-          </w:tcPr>
-          <w:p/>
+          <w:p>
+            <w:r>
+              <w:t>{ } (participant identified via token)</w:t>
+            </w:r>
+          </w:p>
+        </w:tc>
+        <w:tc>
+          <w:tcPr>
+            <w:tcW w:w="3044" w:type="dxa"/>
+          </w:tcPr>
+          <w:p>
+            <w:r>
+              <w:t>201 Created – returns new EventEntrance. 404 Not Found – category does not exist. 409 Conflict – already entered.</w:t>
+            </w:r>
+          </w:p>
         </w:tc>
       </w:tr>
       <w:tr>
         <w:tc>
           <w:tcPr>
-            <w:tcW w:w="1115" w:type="dxa"/>
-          </w:tcPr>
-          <w:p/>
-        </w:tc>
-        <w:tc>
-          <w:tcPr>
-            <w:tcW w:w="2920" w:type="dxa"/>
-          </w:tcPr>
-          <w:p/>
-        </w:tc>
-        <w:tc>
-          <w:tcPr>
-            <w:tcW w:w="2024" w:type="dxa"/>
-          </w:tcPr>
-          <w:p/>
-        </w:tc>
-        <w:tc>
-          <w:tcPr>
-            <w:tcW w:w="1916" w:type="dxa"/>
-          </w:tcPr>
-          <w:p/>
+            <w:tcW w:w="1620" w:type="dxa"/>
+          </w:tcPr>
+          <w:p>
+            <w:r>
+              <w:t>GET</w:t>
+            </w:r>
+          </w:p>
+        </w:tc>
+        <w:tc>
+          <w:tcPr>
+            <w:tcW w:w="3989" w:type="dxa"/>
+          </w:tcPr>
+          <w:p>
+            <w:r>
+              <w:t>/</w:t>
+            </w:r>
+            <w:proofErr w:type="spellStart"/>
+            <w:r>
+              <w:t>api</w:t>
+            </w:r>
+            <w:proofErr w:type="spellEnd"/>
+            <w:r>
+              <w:t>/</w:t>
+            </w:r>
+            <w:r>
+              <w:t>participant</w:t>
+            </w:r>
+            <w:r>
+              <w:t>/me/</w:t>
+            </w:r>
+            <w:proofErr w:type="spellStart"/>
+            <w:r>
+              <w:t>evententrance</w:t>
+            </w:r>
+            <w:proofErr w:type="spellEnd"/>
+          </w:p>
+        </w:tc>
+        <w:tc>
+          <w:tcPr>
+            <w:tcW w:w="1945" w:type="dxa"/>
+          </w:tcPr>
+          <w:p>
+            <w:r>
+              <w:t>Lists the logged-in participant’s event entries, past and upcoming.</w:t>
+            </w:r>
+          </w:p>
+        </w:tc>
+        <w:tc>
+          <w:tcPr>
+            <w:tcW w:w="1559" w:type="dxa"/>
+          </w:tcPr>
+          <w:p>
+            <w:r>
+              <w:t>Participant</w:t>
+            </w:r>
+          </w:p>
         </w:tc>
         <w:tc>
           <w:tcPr>
             <w:tcW w:w="2963" w:type="dxa"/>
           </w:tcPr>
-          <w:p/>
-        </w:tc>
-        <w:tc>
-          <w:tcPr>
-            <w:tcW w:w="2012" w:type="dxa"/>
-          </w:tcPr>
-          <w:p/>
+          <w:p>
+            <w:r>
+              <w:t>None</w:t>
+            </w:r>
+          </w:p>
+        </w:tc>
+        <w:tc>
+          <w:tcPr>
+            <w:tcW w:w="3044" w:type="dxa"/>
+          </w:tcPr>
+          <w:p>
+            <w:r>
+              <w:t>200 OK – returns array of entries with event/category details.</w:t>
+            </w:r>
+          </w:p>
         </w:tc>
       </w:tr>
       <w:tr>
         <w:tc>
           <w:tcPr>
-            <w:tcW w:w="1115" w:type="dxa"/>
-          </w:tcPr>
-          <w:p/>
-        </w:tc>
-        <w:tc>
-          <w:tcPr>
-            <w:tcW w:w="2920" w:type="dxa"/>
-          </w:tcPr>
-          <w:p/>
-        </w:tc>
-        <w:tc>
-          <w:tcPr>
-            <w:tcW w:w="2024" w:type="dxa"/>
-          </w:tcPr>
-          <w:p/>
-        </w:tc>
-        <w:tc>
-          <w:tcPr>
-            <w:tcW w:w="1916" w:type="dxa"/>
-          </w:tcPr>
-          <w:p/>
+            <w:tcW w:w="1620" w:type="dxa"/>
+          </w:tcPr>
+          <w:p>
+            <w:r>
+              <w:t>GET</w:t>
+            </w:r>
+          </w:p>
+        </w:tc>
+        <w:tc>
+          <w:tcPr>
+            <w:tcW w:w="3989" w:type="dxa"/>
+          </w:tcPr>
+          <w:p>
+            <w:r>
+              <w:t>/</w:t>
+            </w:r>
+            <w:proofErr w:type="spellStart"/>
+            <w:proofErr w:type="gramStart"/>
+            <w:r>
+              <w:t>api</w:t>
+            </w:r>
+            <w:proofErr w:type="spellEnd"/>
+            <w:proofErr w:type="gramEnd"/>
+            <w:r>
+              <w:t>/</w:t>
+            </w:r>
+            <w:r>
+              <w:t>event</w:t>
+            </w:r>
+            <w:r>
+              <w:t>/{id}/</w:t>
+            </w:r>
+            <w:proofErr w:type="spellStart"/>
+            <w:r>
+              <w:t>evententrance</w:t>
+            </w:r>
+            <w:proofErr w:type="spellEnd"/>
+          </w:p>
+        </w:tc>
+        <w:tc>
+          <w:tcPr>
+            <w:tcW w:w="1945" w:type="dxa"/>
+          </w:tcPr>
+          <w:p>
+            <w:r>
+              <w:t>Lists all EventEntrance records for an event (organiser view).</w:t>
+            </w:r>
+          </w:p>
+        </w:tc>
+        <w:tc>
+          <w:tcPr>
+            <w:tcW w:w="1559" w:type="dxa"/>
+          </w:tcPr>
+          <w:p>
+            <w:r>
+              <w:t>Organiser</w:t>
+            </w:r>
+          </w:p>
         </w:tc>
         <w:tc>
           <w:tcPr>
             <w:tcW w:w="2963" w:type="dxa"/>
           </w:tcPr>
-          <w:p/>
-        </w:tc>
-        <w:tc>
-          <w:tcPr>
-            <w:tcW w:w="2012" w:type="dxa"/>
-          </w:tcPr>
-          <w:p/>
+          <w:p>
+            <w:r>
+              <w:t>None</w:t>
+            </w:r>
+          </w:p>
+        </w:tc>
+        <w:tc>
+          <w:tcPr>
+            <w:tcW w:w="3044" w:type="dxa"/>
+          </w:tcPr>
+          <w:p>
+            <w:r>
+              <w:t>200 OK – returns array of entries. 403 Forbidden – not the event owner.</w:t>
+            </w:r>
+          </w:p>
         </w:tc>
       </w:tr>
       <w:tr>
         <w:tc>
           <w:tcPr>
-            <w:tcW w:w="1115" w:type="dxa"/>
-          </w:tcPr>
-          <w:p/>
-        </w:tc>
-        <w:tc>
-          <w:tcPr>
-            <w:tcW w:w="2920" w:type="dxa"/>
-          </w:tcPr>
-          <w:p/>
-        </w:tc>
-        <w:tc>
-          <w:tcPr>
-            <w:tcW w:w="2024" w:type="dxa"/>
-          </w:tcPr>
-          <w:p/>
-        </w:tc>
-        <w:tc>
-          <w:tcPr>
-            <w:tcW w:w="1916" w:type="dxa"/>
-          </w:tcPr>
-          <w:p/>
+            <w:tcW w:w="1620" w:type="dxa"/>
+          </w:tcPr>
+          <w:p>
+            <w:r>
+              <w:t>DELETE</w:t>
+            </w:r>
+          </w:p>
+        </w:tc>
+        <w:tc>
+          <w:tcPr>
+            <w:tcW w:w="3989" w:type="dxa"/>
+          </w:tcPr>
+          <w:p>
+            <w:r>
+              <w:t>/</w:t>
+            </w:r>
+            <w:proofErr w:type="spellStart"/>
+            <w:proofErr w:type="gramStart"/>
+            <w:r>
+              <w:t>api</w:t>
+            </w:r>
+            <w:proofErr w:type="spellEnd"/>
+            <w:proofErr w:type="gramEnd"/>
+            <w:r>
+              <w:t>/</w:t>
+            </w:r>
+            <w:proofErr w:type="spellStart"/>
+            <w:proofErr w:type="gramStart"/>
+            <w:r>
+              <w:t>evententrance</w:t>
+            </w:r>
+            <w:proofErr w:type="spellEnd"/>
+            <w:r>
+              <w:t>/{</w:t>
+            </w:r>
+            <w:proofErr w:type="gramEnd"/>
+            <w:r>
+              <w:t>id}</w:t>
+            </w:r>
+          </w:p>
+        </w:tc>
+        <w:tc>
+          <w:tcPr>
+            <w:tcW w:w="1945" w:type="dxa"/>
+          </w:tcPr>
+          <w:p>
+            <w:r>
+              <w:t>Withdraws a participant’s EventEntrance.</w:t>
+            </w:r>
+          </w:p>
+        </w:tc>
+        <w:tc>
+          <w:tcPr>
+            <w:tcW w:w="1559" w:type="dxa"/>
+          </w:tcPr>
+          <w:p>
+            <w:r>
+              <w:t>Participant (own entry) or Organiser</w:t>
+            </w:r>
+          </w:p>
         </w:tc>
         <w:tc>
           <w:tcPr>
             <w:tcW w:w="2963" w:type="dxa"/>
           </w:tcPr>
-          <w:p/>
-        </w:tc>
-        <w:tc>
-          <w:tcPr>
-            <w:tcW w:w="2012" w:type="dxa"/>
-          </w:tcPr>
-          <w:p/>
+          <w:p>
+            <w:r>
+              <w:t>None</w:t>
+            </w:r>
+          </w:p>
+        </w:tc>
+        <w:tc>
+          <w:tcPr>
+            <w:tcW w:w="3044" w:type="dxa"/>
+          </w:tcPr>
+          <w:p>
+            <w:r>
+              <w:t>204 No Content. 403 Forbidden. 404 Not Found.</w:t>
+            </w:r>
+          </w:p>
         </w:tc>
       </w:tr>
       <w:tr>
         <w:tc>
           <w:tcPr>
-            <w:tcW w:w="1115" w:type="dxa"/>
-          </w:tcPr>
-          <w:p/>
-        </w:tc>
-        <w:tc>
-          <w:tcPr>
-            <w:tcW w:w="2920" w:type="dxa"/>
-          </w:tcPr>
-          <w:p/>
-        </w:tc>
-        <w:tc>
-          <w:tcPr>
-            <w:tcW w:w="2024" w:type="dxa"/>
-          </w:tcPr>
-          <w:p/>
-        </w:tc>
-        <w:tc>
-          <w:tcPr>
-            <w:tcW w:w="1916" w:type="dxa"/>
-          </w:tcPr>
-          <w:p/>
+            <w:tcW w:w="1620" w:type="dxa"/>
+          </w:tcPr>
+          <w:p>
+            <w:r>
+              <w:lastRenderedPageBreak/>
+              <w:t>POST</w:t>
+            </w:r>
+          </w:p>
+        </w:tc>
+        <w:tc>
+          <w:tcPr>
+            <w:tcW w:w="3989" w:type="dxa"/>
+          </w:tcPr>
+          <w:p>
+            <w:r>
+              <w:t>/</w:t>
+            </w:r>
+            <w:proofErr w:type="spellStart"/>
+            <w:proofErr w:type="gramStart"/>
+            <w:r>
+              <w:t>api</w:t>
+            </w:r>
+            <w:proofErr w:type="spellEnd"/>
+            <w:proofErr w:type="gramEnd"/>
+            <w:r>
+              <w:t>/</w:t>
+            </w:r>
+            <w:proofErr w:type="spellStart"/>
+            <w:r>
+              <w:t>evententrance</w:t>
+            </w:r>
+            <w:proofErr w:type="spellEnd"/>
+            <w:r>
+              <w:t>/{id}/result</w:t>
+            </w:r>
+          </w:p>
+        </w:tc>
+        <w:tc>
+          <w:tcPr>
+            <w:tcW w:w="1945" w:type="dxa"/>
+          </w:tcPr>
+          <w:p>
+            <w:r>
+              <w:t>Captures a finish result for a specific EventEntrance.</w:t>
+            </w:r>
+          </w:p>
+        </w:tc>
+        <w:tc>
+          <w:tcPr>
+            <w:tcW w:w="1559" w:type="dxa"/>
+          </w:tcPr>
+          <w:p>
+            <w:r>
+              <w:t>Organiser</w:t>
+            </w:r>
+          </w:p>
         </w:tc>
         <w:tc>
           <w:tcPr>
             <w:tcW w:w="2963" w:type="dxa"/>
           </w:tcPr>
-          <w:p/>
-        </w:tc>
-        <w:tc>
-          <w:tcPr>
-            <w:tcW w:w="2012" w:type="dxa"/>
-          </w:tcPr>
-          <w:p/>
+          <w:p>
+            <w:r>
+              <w:t>{ finishTime }</w:t>
+            </w:r>
+          </w:p>
+        </w:tc>
+        <w:tc>
+          <w:tcPr>
+            <w:tcW w:w="3044" w:type="dxa"/>
+          </w:tcPr>
+          <w:p>
+            <w:r>
+              <w:t>201 Created – returns new result. 404 Not Found – entry does not exist. 409 Conflict – result already recorded.</w:t>
+            </w:r>
+          </w:p>
         </w:tc>
       </w:tr>
       <w:tr>
         <w:tc>
           <w:tcPr>
-            <w:tcW w:w="1115" w:type="dxa"/>
-          </w:tcPr>
-          <w:p/>
-        </w:tc>
-        <w:tc>
-          <w:tcPr>
-            <w:tcW w:w="2920" w:type="dxa"/>
-          </w:tcPr>
-          <w:p/>
-        </w:tc>
-        <w:tc>
-          <w:tcPr>
-            <w:tcW w:w="2024" w:type="dxa"/>
-          </w:tcPr>
-          <w:p/>
-        </w:tc>
-        <w:tc>
-          <w:tcPr>
-            <w:tcW w:w="1916" w:type="dxa"/>
-          </w:tcPr>
-          <w:p/>
+            <w:tcW w:w="1620" w:type="dxa"/>
+          </w:tcPr>
+          <w:p>
+            <w:r>
+              <w:t>GET</w:t>
+            </w:r>
+          </w:p>
+        </w:tc>
+        <w:tc>
+          <w:tcPr>
+            <w:tcW w:w="3989" w:type="dxa"/>
+          </w:tcPr>
+          <w:p>
+            <w:r>
+              <w:t>/</w:t>
+            </w:r>
+            <w:proofErr w:type="spellStart"/>
+            <w:proofErr w:type="gramStart"/>
+            <w:r>
+              <w:t>api</w:t>
+            </w:r>
+            <w:proofErr w:type="spellEnd"/>
+            <w:proofErr w:type="gramEnd"/>
+            <w:r>
+              <w:t>/</w:t>
+            </w:r>
+            <w:proofErr w:type="gramStart"/>
+            <w:r>
+              <w:t>event</w:t>
+            </w:r>
+            <w:r>
+              <w:t>/{id}/</w:t>
+            </w:r>
+            <w:proofErr w:type="gramEnd"/>
+            <w:r>
+              <w:t>result</w:t>
+            </w:r>
+          </w:p>
+        </w:tc>
+        <w:tc>
+          <w:tcPr>
+            <w:tcW w:w="1945" w:type="dxa"/>
+          </w:tcPr>
+          <w:p>
+            <w:r>
+              <w:t xml:space="preserve">Retrieves all </w:t>
+            </w:r>
+            <w:r>
+              <w:t>results</w:t>
+            </w:r>
+            <w:r>
+              <w:t xml:space="preserve"> for an event (leaderboard, grouped by category).</w:t>
+            </w:r>
+          </w:p>
+        </w:tc>
+        <w:tc>
+          <w:tcPr>
+            <w:tcW w:w="1559" w:type="dxa"/>
+          </w:tcPr>
+          <w:p>
+            <w:r>
+              <w:t>None (public)</w:t>
+            </w:r>
+          </w:p>
         </w:tc>
         <w:tc>
           <w:tcPr>
             <w:tcW w:w="2963" w:type="dxa"/>
           </w:tcPr>
-          <w:p/>
-        </w:tc>
-        <w:tc>
-          <w:tcPr>
-            <w:tcW w:w="2012" w:type="dxa"/>
-          </w:tcPr>
-          <w:p/>
+          <w:p>
+            <w:r>
+              <w:t>None</w:t>
+            </w:r>
+          </w:p>
+        </w:tc>
+        <w:tc>
+          <w:tcPr>
+            <w:tcW w:w="3044" w:type="dxa"/>
+          </w:tcPr>
+          <w:p>
+            <w:r>
+              <w:t xml:space="preserve">200 OK – returns array of </w:t>
+            </w:r>
+            <w:r>
+              <w:t>result</w:t>
+            </w:r>
+            <w:r>
+              <w:t>. 404 Not Found.</w:t>
+            </w:r>
+          </w:p>
         </w:tc>
       </w:tr>
       <w:tr>
         <w:tc>
           <w:tcPr>
-            <w:tcW w:w="1115" w:type="dxa"/>
-          </w:tcPr>
-          <w:p/>
-        </w:tc>
-        <w:tc>
-          <w:tcPr>
-            <w:tcW w:w="2920" w:type="dxa"/>
-          </w:tcPr>
-          <w:p/>
-        </w:tc>
-        <w:tc>
-          <w:tcPr>
-            <w:tcW w:w="2024" w:type="dxa"/>
-          </w:tcPr>
-          <w:p/>
-        </w:tc>
-        <w:tc>
-          <w:tcPr>
-            <w:tcW w:w="1916" w:type="dxa"/>
-          </w:tcPr>
-          <w:p/>
+            <w:tcW w:w="1620" w:type="dxa"/>
+          </w:tcPr>
+          <w:p>
+            <w:r>
+              <w:t>GET</w:t>
+            </w:r>
+          </w:p>
+        </w:tc>
+        <w:tc>
+          <w:tcPr>
+            <w:tcW w:w="3989" w:type="dxa"/>
+          </w:tcPr>
+          <w:p>
+            <w:r>
+              <w:t>/</w:t>
+            </w:r>
+            <w:proofErr w:type="spellStart"/>
+            <w:proofErr w:type="gramStart"/>
+            <w:r>
+              <w:t>api</w:t>
+            </w:r>
+            <w:proofErr w:type="spellEnd"/>
+            <w:proofErr w:type="gramEnd"/>
+            <w:r>
+              <w:t>/</w:t>
+            </w:r>
+            <w:proofErr w:type="gramStart"/>
+            <w:r>
+              <w:t>category</w:t>
+            </w:r>
+            <w:r>
+              <w:t>/{id}/</w:t>
+            </w:r>
+            <w:proofErr w:type="gramEnd"/>
+            <w:r>
+              <w:t>result</w:t>
+            </w:r>
+          </w:p>
+        </w:tc>
+        <w:tc>
+          <w:tcPr>
+            <w:tcW w:w="1945" w:type="dxa"/>
+          </w:tcPr>
+          <w:p>
+            <w:r>
+              <w:t xml:space="preserve">Retrieves </w:t>
+            </w:r>
+            <w:r>
+              <w:t>result</w:t>
+            </w:r>
+            <w:r>
+              <w:t xml:space="preserve"> for a single category, as required by the “</w:t>
+            </w:r>
+            <w:r>
+              <w:t>Result</w:t>
+            </w:r>
+            <w:r>
+              <w:t xml:space="preserve"> are provided for each category” business rule.</w:t>
+            </w:r>
+          </w:p>
+        </w:tc>
+        <w:tc>
+          <w:tcPr>
+            <w:tcW w:w="1559" w:type="dxa"/>
+          </w:tcPr>
+          <w:p>
+            <w:r>
+              <w:t>None (public)</w:t>
+            </w:r>
+          </w:p>
         </w:tc>
         <w:tc>
           <w:tcPr>
             <w:tcW w:w="2963" w:type="dxa"/>
           </w:tcPr>
-          <w:p/>
-        </w:tc>
-        <w:tc>
-          <w:tcPr>
-            <w:tcW w:w="2012" w:type="dxa"/>
-          </w:tcPr>
-          <w:p/>
+          <w:p>
+            <w:r>
+              <w:t>None</w:t>
+            </w:r>
+          </w:p>
+        </w:tc>
+        <w:tc>
+          <w:tcPr>
+            <w:tcW w:w="3044" w:type="dxa"/>
+          </w:tcPr>
+          <w:p>
+            <w:r>
+              <w:t xml:space="preserve">200 OK – returns array of </w:t>
+            </w:r>
+            <w:r>
+              <w:t>result</w:t>
+            </w:r>
+            <w:r>
+              <w:t xml:space="preserve"> ordered by finish time. 404 Not Found.</w:t>
+            </w:r>
+          </w:p>
         </w:tc>
       </w:tr>
       <w:tr>
         <w:tc>
           <w:tcPr>
-            <w:tcW w:w="1115" w:type="dxa"/>
-          </w:tcPr>
-          <w:p/>
-        </w:tc>
-        <w:tc>
-          <w:tcPr>
-            <w:tcW w:w="2920" w:type="dxa"/>
-          </w:tcPr>
-          <w:p/>
-        </w:tc>
-        <w:tc>
-          <w:tcPr>
-            <w:tcW w:w="2024" w:type="dxa"/>
-          </w:tcPr>
-          <w:p/>
-        </w:tc>
-        <w:tc>
-          <w:tcPr>
-            <w:tcW w:w="1916" w:type="dxa"/>
-          </w:tcPr>
-          <w:p/>
+            <w:tcW w:w="1620" w:type="dxa"/>
+          </w:tcPr>
+          <w:p>
+            <w:r>
+              <w:t>GET</w:t>
+            </w:r>
+          </w:p>
+        </w:tc>
+        <w:tc>
+          <w:tcPr>
+            <w:tcW w:w="3989" w:type="dxa"/>
+          </w:tcPr>
+          <w:p>
+            <w:r>
+              <w:t>/</w:t>
+            </w:r>
+            <w:proofErr w:type="spellStart"/>
+            <w:r>
+              <w:t>api</w:t>
+            </w:r>
+            <w:proofErr w:type="spellEnd"/>
+            <w:r>
+              <w:t>/</w:t>
+            </w:r>
+            <w:r>
+              <w:t>participant</w:t>
+            </w:r>
+            <w:r>
+              <w:t>/me/</w:t>
+            </w:r>
+            <w:r>
+              <w:t>result</w:t>
+            </w:r>
+          </w:p>
+        </w:tc>
+        <w:tc>
+          <w:tcPr>
+            <w:tcW w:w="1945" w:type="dxa"/>
+          </w:tcPr>
+          <w:p>
+            <w:r>
+              <w:t>Retrieves the logged-in participant’s personal result history across all entries.</w:t>
+            </w:r>
+          </w:p>
+        </w:tc>
+        <w:tc>
+          <w:tcPr>
+            <w:tcW w:w="1559" w:type="dxa"/>
+          </w:tcPr>
+          <w:p>
+            <w:r>
+              <w:t>Participant</w:t>
+            </w:r>
+          </w:p>
         </w:tc>
         <w:tc>
           <w:tcPr>
             <w:tcW w:w="2963" w:type="dxa"/>
           </w:tcPr>
-          <w:p/>
-        </w:tc>
-        <w:tc>
-          <w:tcPr>
-            <w:tcW w:w="2012" w:type="dxa"/>
-          </w:tcPr>
-          <w:p/>
-        </w:tc>
-      </w:tr>
-      <w:tr>
-        <w:tc>
-          <w:tcPr>
-            <w:tcW w:w="1115" w:type="dxa"/>
-          </w:tcPr>
-          <w:p/>
-        </w:tc>
-        <w:tc>
-          <w:tcPr>
-            <w:tcW w:w="2920" w:type="dxa"/>
-          </w:tcPr>
-          <w:p/>
-        </w:tc>
-        <w:tc>
-          <w:tcPr>
-            <w:tcW w:w="2024" w:type="dxa"/>
-          </w:tcPr>
-          <w:p/>
-        </w:tc>
-        <w:tc>
-          <w:tcPr>
-            <w:tcW w:w="1916" w:type="dxa"/>
-          </w:tcPr>
-          <w:p/>
-        </w:tc>
-        <w:tc>
-          <w:tcPr>
-            <w:tcW w:w="2963" w:type="dxa"/>
-          </w:tcPr>
-          <w:p/>
-        </w:tc>
-        <w:tc>
-          <w:tcPr>
-            <w:tcW w:w="2012" w:type="dxa"/>
-          </w:tcPr>
-          <w:p/>
+          <w:p>
+            <w:r>
+              <w:t>None</w:t>
+            </w:r>
+          </w:p>
+        </w:tc>
+        <w:tc>
+          <w:tcPr>
+            <w:tcW w:w="3044" w:type="dxa"/>
+          </w:tcPr>
+          <w:p>
+            <w:r>
+              <w:t xml:space="preserve">200 OK – returns array of </w:t>
+            </w:r>
+            <w:r>
+              <w:t>result</w:t>
+            </w:r>
+            <w:r>
+              <w:t>.</w:t>
+            </w:r>
+          </w:p>
         </w:tc>
       </w:tr>
     </w:tbl>
@@ -5219,6 +6192,7 @@
   <w:style w:type="character" w:default="1" w:styleId="DefaultParagraphFont">
     <w:name w:val="Default Paragraph Font"/>
     <w:uiPriority w:val="1"/>
+    <w:semiHidden/>
     <w:unhideWhenUsed/>
   </w:style>
   <w:style w:type="table" w:default="1" w:styleId="TableNormal">

</xml_diff>